<commit_message>
Fix v2 reading list after citation check
Remove four readings that could not be confirmed (Koo 2025, Yang 2021,
Jung 2021, Kim-Gibson 1997), correct the Wojcik-Andrews & Yoo chapter
title, and drop the unconfirmed Angouleme screening claim for Unfinished
Story. Kim Jinsook's JCMS article becomes required in Week 7.

Co-Authored-By: Claude Opus 5.5 <noreply@anthropic.com>
Claude-Session: https://claude.ai/code/session_01UfpqMLi4rQXcwYbRgn6tjT
</commit_message>
<xml_diff>
--- a/korean-culture-syllabus/Who_Gets_to_Be_the_Korean_Woman_v2.docx
+++ b/korean-culture-syllabus/Who_Gets_to_Be_the_Korean_Woman_v2.docx
@@ -2473,7 +2473,7 @@
           <w:rFonts w:cs="Times New Roman"/>
           <w:highlight w:val="yellow"/>
         </w:rPr>
-        <w:t xml:space="preserve">Yang Hyunah (1998); Wojcik-Andrews &amp; Yoo (2019); Kwon Vicki Sung-yeon (2019); news coverage of Kim Hak-sun’s public testimony (August 14, 1991); paintings by survivor Kang Duk-kyung; Unfinished Story (끝나지 않은 이야기; M-Line Studio for the Ministry of Gender Equality and Family, screened at the 2014 Angoulême International Comics Festival; about 15 minutes, screened in full); the Statue of Peace (2011).</w:t>
+        <w:t xml:space="preserve">Yang Hyunah (1998); Wojcik-Andrews &amp; Yoo (2019); Kwon Vicki Sung-yeon (2019); news coverage of Kim Hak-sun’s public testimony (August 14, 1991); paintings by survivor Kang Duk-kyung; Unfinished Story (끝나지 않은 이야기; M-Line Studio with the Ministry of Gender Equality and Family, c. 2013; about 15 minutes, screened in full); the Statue of Peace (2011).</w:t>
       </w:r>
     </w:p>
     <w:p>
@@ -2499,7 +2499,7 @@
           <w:rFonts w:cs="Times New Roman"/>
           <w:highlight w:val="yellow"/>
         </w:rPr>
-        <w:t xml:space="preserve">Discuss how the chastity ideal studied in Weeks 2–4 kept survivors silent until 1991; compare three narrators of the same history: a survivor’s own paintings, a state-commissioned animation made for an international audience, and a civic monument that presents the victim as an innocent girl; ask what the “girl” image shows and hides (survivors’ old age, anger, and political demands). Field trip briefing, then the visit to the China “Comfort Women” History Museum at Shanghai Normal University (see Field Trip section).</w:t>
+        <w:t xml:space="preserve">Discuss how the chastity ideal studied in Weeks 2–4 kept survivors silent until 1991; compare three narrators of the same history: a survivor’s own paintings, a government-sponsored animation, and a civic monument that presents the victim as an innocent girl; ask what the “girl” image shows and hides (survivors’ old age, anger, and political demands). Field trip briefing, then the visit to the China “Comfort Women” History Museum at Shanghai Normal University (see Field Trip section).</w:t>
       </w:r>
     </w:p>
     <w:p>
@@ -2719,7 +2719,7 @@
           <w:rFonts w:cs="Times New Roman"/>
           <w:highlight w:val="yellow"/>
         </w:rPr>
-        <w:t xml:space="preserve">Cho Nam-joo, Kim Jiyoung, Born 1982 (complete); Kim Jinsook (2021, Korea Journal); Koo (2025); clips from Kim Ji-young, Born 1982 (dir. Kim Do-young, 2019); photographs of the Gangnam Station Exit 10 Post-it memorial (May 2016); reader reception of the Chinese edition (2019).</w:t>
+        <w:t xml:space="preserve">Cho Nam-joo, Kim Jiyoung, Born 1982 (complete); Kim Jinsook (2021, Korea Journal); Kim Jinsook (2021, JCMS); clips from Kim Ji-young, Born 1982 (dir. Kim Do-young, 2019); photographs of the Gangnam Station Exit 10 Post-it memorial (May 2016); reader reception of the Chinese edition (2019).</w:t>
       </w:r>
     </w:p>
     <w:p>
@@ -4198,7 +4198,7 @@
           <w:rFonts w:cs="Times New Roman"/>
           <w:highlight w:val="yellow"/>
         </w:rPr>
-        <w:t xml:space="preserve">Wojcik-Andrews, I., &amp; Yoo, H.-J. (2019). Revisiting the history of comfort women and representing trauma in the South Korean films, </w:t>
+        <w:t xml:space="preserve">Wojcik-Andrews, I., &amp; Yoo, H.-J. (2019). Revisiting comfort women history and representing trauma in South Korean films </w:t>
       </w:r>
       <w:r>
         <w:rPr>
@@ -4206,7 +4206,7 @@
           <w:i/>
           <w:highlight w:val="yellow"/>
         </w:rPr>
-        <w:t xml:space="preserve">A Never-Ending Story</w:t>
+        <w:t xml:space="preserve">Never Ending Story</w:t>
       </w:r>
       <w:r>
         <w:rPr>
@@ -4350,7 +4350,7 @@
           <w:rFonts w:cs="Times New Roman"/>
           <w:highlight w:val="yellow"/>
         </w:rPr>
-        <w:t xml:space="preserve">Kim-Gibson, D. S. (1997). They are our grandmas. </w:t>
+        <w:t xml:space="preserve">Chung, C. S. (1997). The origin and development of the military sexual slavery problem in imperial Japan. </w:t>
       </w:r>
       <w:r>
         <w:rPr>
@@ -4365,7 +4365,7 @@
           <w:rFonts w:cs="Times New Roman"/>
           <w:highlight w:val="yellow"/>
         </w:rPr>
-        <w:t xml:space="preserve">(1), 255–274.</w:t>
+        <w:t xml:space="preserve">(1), 219–253.</w:t>
       </w:r>
     </w:p>
     <w:p>
@@ -4384,7 +4384,7 @@
           <w:rFonts w:cs="Times New Roman"/>
           <w:highlight w:val="yellow"/>
         </w:rPr>
-        <w:t xml:space="preserve">Chung, C. S. (1997). The origin and development of the military sexual slavery problem in imperial Japan. </w:t>
+        <w:t xml:space="preserve">Kang, S. H. (2019). The U.S. Army photography and the “seen side” and “blind side” of the Japanese military comfort women: The still pictures and motion pictures of the Korean comfort girls in Myitkyina, Sungshan, and Tengchung. </w:t>
       </w:r>
       <w:r>
         <w:rPr>
@@ -4392,14 +4392,14 @@
           <w:i/>
           <w:highlight w:val="yellow"/>
         </w:rPr>
-        <w:t xml:space="preserve">positions: east asia cultures critique, 5</w:t>
-      </w:r>
-      <w:r>
-        <w:rPr>
-          <w:rFonts w:cs="Times New Roman"/>
-          <w:highlight w:val="yellow"/>
-        </w:rPr>
-        <w:t xml:space="preserve">(1), 219–253.</w:t>
+        <w:t xml:space="preserve">Korea Journal, 59</w:t>
+      </w:r>
+      <w:r>
+        <w:rPr>
+          <w:rFonts w:cs="Times New Roman"/>
+          <w:highlight w:val="yellow"/>
+        </w:rPr>
+        <w:t xml:space="preserve">(2), 144–176. Open access.</w:t>
       </w:r>
     </w:p>
     <w:p>
@@ -4418,7 +4418,7 @@
           <w:rFonts w:cs="Times New Roman"/>
           <w:highlight w:val="yellow"/>
         </w:rPr>
-        <w:t xml:space="preserve">Kang, S. H. (2019). The U.S. Army photography and the “seen side” and “blind side” of the Japanese military comfort women: The still pictures and motion pictures of the Korean comfort girls in Myitkyina, Sungshan, and Tengchung. </w:t>
+        <w:t xml:space="preserve">Choi, C., &amp; Yang, H. (Eds. &amp; Trans.). (2023). </w:t>
       </w:r>
       <w:r>
         <w:rPr>
@@ -4426,14 +4426,14 @@
           <w:i/>
           <w:highlight w:val="yellow"/>
         </w:rPr>
-        <w:t xml:space="preserve">Korea Journal, 59</w:t>
-      </w:r>
-      <w:r>
-        <w:rPr>
-          <w:rFonts w:cs="Times New Roman"/>
-          <w:highlight w:val="yellow"/>
-        </w:rPr>
-        <w:t xml:space="preserve">(2), 144–176. Open access.</w:t>
+        <w:t xml:space="preserve">Voices of the Korean comfort women: History rewritten from memories</w:t>
+      </w:r>
+      <w:r>
+        <w:rPr>
+          <w:rFonts w:cs="Times New Roman"/>
+          <w:highlight w:val="yellow"/>
+        </w:rPr>
+        <w:t xml:space="preserve">. Routledge.</w:t>
       </w:r>
     </w:p>
     <w:p>
@@ -4452,7 +4452,7 @@
           <w:rFonts w:cs="Times New Roman"/>
           <w:highlight w:val="yellow"/>
         </w:rPr>
-        <w:t xml:space="preserve">Choi, C., &amp; Yang, H. (Eds. &amp; Trans.). (2023). </w:t>
+        <w:t xml:space="preserve">Kwon, H. (2017). The paintings of Korean comfort woman Duk-kyung Kang: Postcolonial and decolonial aesthetics for colonized bodies. </w:t>
       </w:r>
       <w:r>
         <w:rPr>
@@ -4460,14 +4460,34 @@
           <w:i/>
           <w:highlight w:val="yellow"/>
         </w:rPr>
-        <w:t xml:space="preserve">Voices of the Korean comfort women: History rewritten from memories</w:t>
-      </w:r>
-      <w:r>
-        <w:rPr>
-          <w:rFonts w:cs="Times New Roman"/>
-          <w:highlight w:val="yellow"/>
-        </w:rPr>
-        <w:t xml:space="preserve">. Routledge.</w:t>
+        <w:t xml:space="preserve">Feminist Studies, 43</w:t>
+      </w:r>
+      <w:r>
+        <w:rPr>
+          <w:rFonts w:cs="Times New Roman"/>
+          <w:highlight w:val="yellow"/>
+        </w:rPr>
+        <w:t xml:space="preserve">(3), 571–609.</w:t>
+      </w:r>
+    </w:p>
+    <w:p>
+      <w:pPr>
+        <w:keepNext/>
+        <w:pBdr>
+          <w:bottom w:val="single" w:sz="4" w:space="1" w:color="auto"/>
+        </w:pBdr>
+        <w:spacing w:before="40" w:after="20" w:line="240" w:lineRule="auto"/>
+        <w:rPr>
+          <w:rFonts w:cs="Times New Roman"/>
+        </w:rPr>
+      </w:pPr>
+      <w:r>
+        <w:rPr>
+          <w:rFonts w:cs="Times New Roman"/>
+          <w:i/>
+          <w:highlight w:val="yellow"/>
+        </w:rPr>
+        <w:t xml:space="preserve">Media</w:t>
       </w:r>
     </w:p>
     <w:p>
@@ -4484,44 +4504,17 @@
       <w:r>
         <w:rPr>
           <w:rFonts w:cs="Times New Roman"/>
-          <w:highlight w:val="yellow"/>
-        </w:rPr>
-        <w:t xml:space="preserve">Kwon, H. (2017). The paintings of Korean comfort woman Duk-kyung Kang: Postcolonial and decolonial aesthetics for colonized bodies. </w:t>
-      </w:r>
-      <w:r>
-        <w:rPr>
-          <w:rFonts w:cs="Times New Roman"/>
           <w:i/>
           <w:highlight w:val="yellow"/>
         </w:rPr>
-        <w:t xml:space="preserve">Feminist Studies, 43</w:t>
-      </w:r>
-      <w:r>
-        <w:rPr>
-          <w:rFonts w:cs="Times New Roman"/>
-          <w:highlight w:val="yellow"/>
-        </w:rPr>
-        <w:t xml:space="preserve">(3), 571–609.</w:t>
-      </w:r>
-    </w:p>
-    <w:p>
-      <w:pPr>
-        <w:keepNext/>
-        <w:pBdr>
-          <w:bottom w:val="single" w:sz="4" w:space="1" w:color="auto"/>
-        </w:pBdr>
-        <w:spacing w:before="40" w:after="20" w:line="240" w:lineRule="auto"/>
-        <w:rPr>
-          <w:rFonts w:cs="Times New Roman"/>
-        </w:rPr>
-      </w:pPr>
-      <w:r>
-        <w:rPr>
-          <w:rFonts w:cs="Times New Roman"/>
-          <w:i/>
-          <w:highlight w:val="yellow"/>
-        </w:rPr>
-        <w:t xml:space="preserve">Media</w:t>
+        <w:t xml:space="preserve">Unfinished story</w:t>
+      </w:r>
+      <w:r>
+        <w:rPr>
+          <w:rFonts w:cs="Times New Roman"/>
+          <w:highlight w:val="yellow"/>
+        </w:rPr>
+        <w:t xml:space="preserve"> [끝나지 않은 이야기; animated short]. (c. 2013). M-Line Studio, with the Ministry of Gender Equality and Family. Full (about 15 minutes).</w:t>
       </w:r>
     </w:p>
     <w:p>
@@ -4538,17 +4531,49 @@
       <w:r>
         <w:rPr>
           <w:rFonts w:cs="Times New Roman"/>
+          <w:highlight w:val="yellow"/>
+        </w:rPr>
+        <w:t xml:space="preserve">Kang Duk-kyung, selected paintings (House of Sharing). Kim Seo-kyung &amp; Kim Eun-sung, Statue of Peace (Seoul, 2011) and the Korea-China statue pair (Shanghai Normal University, 2016). News coverage of Kim Hak-sun’s testimony, August 14, 1991.</w:t>
+      </w:r>
+    </w:p>
+    <w:p>
+      <w:pPr>
+        <w:keepNext/>
+        <w:pBdr>
+          <w:bottom w:val="single" w:sz="4" w:space="1" w:color="auto"/>
+        </w:pBdr>
+        <w:spacing w:before="120" w:after="30" w:line="240" w:lineRule="auto"/>
+        <w:rPr>
+          <w:rFonts w:cs="Times New Roman"/>
+        </w:rPr>
+      </w:pPr>
+      <w:r>
+        <w:rPr>
+          <w:rFonts w:cs="Times New Roman"/>
+          <w:b/>
+          <w:highlight w:val="yellow"/>
+        </w:rPr>
+        <w:t xml:space="preserve">Week 6</w:t>
+      </w:r>
+    </w:p>
+    <w:p>
+      <w:pPr>
+        <w:keepNext/>
+        <w:pBdr>
+          <w:bottom w:val="single" w:sz="4" w:space="1" w:color="auto"/>
+        </w:pBdr>
+        <w:spacing w:before="40" w:after="20" w:line="240" w:lineRule="auto"/>
+        <w:rPr>
+          <w:rFonts w:cs="Times New Roman"/>
+        </w:rPr>
+      </w:pPr>
+      <w:r>
+        <w:rPr>
+          <w:rFonts w:cs="Times New Roman"/>
           <w:i/>
           <w:highlight w:val="yellow"/>
         </w:rPr>
-        <w:t xml:space="preserve">Unfinished story</w:t>
-      </w:r>
-      <w:r>
-        <w:rPr>
-          <w:rFonts w:cs="Times New Roman"/>
-          <w:highlight w:val="yellow"/>
-        </w:rPr>
-        <w:t xml:space="preserve"> [끝나지 않은 이야기; animated short]. (c. 2013–2014). M-Line Studio, for the Ministry of Gender Equality and Family. Screened at the 41st Angoulême International Comics Festival, 2014. Full (about 15 minutes).</w:t>
+        <w:t xml:space="preserve">Required</w:t>
       </w:r>
     </w:p>
     <w:p>
@@ -4567,47 +4592,22 @@
           <w:rFonts w:cs="Times New Roman"/>
           <w:highlight w:val="yellow"/>
         </w:rPr>
-        <w:t xml:space="preserve">Kang Duk-kyung, selected paintings (House of Sharing). Kim Seo-kyung &amp; Kim Eun-sung, Statue of Peace (Seoul, 2011) and the Korea-China statue pair (Shanghai Normal University, 2016). News coverage of Kim Hak-sun’s testimony, August 14, 1991.</w:t>
-      </w:r>
-    </w:p>
-    <w:p>
-      <w:pPr>
-        <w:keepNext/>
-        <w:pBdr>
-          <w:bottom w:val="single" w:sz="4" w:space="1" w:color="auto"/>
-        </w:pBdr>
-        <w:spacing w:before="120" w:after="30" w:line="240" w:lineRule="auto"/>
-        <w:rPr>
-          <w:rFonts w:cs="Times New Roman"/>
-        </w:rPr>
-      </w:pPr>
-      <w:r>
-        <w:rPr>
-          <w:rFonts w:cs="Times New Roman"/>
-          <w:b/>
-          <w:highlight w:val="yellow"/>
-        </w:rPr>
-        <w:t xml:space="preserve">Week 6</w:t>
-      </w:r>
-    </w:p>
-    <w:p>
-      <w:pPr>
-        <w:keepNext/>
-        <w:pBdr>
-          <w:bottom w:val="single" w:sz="4" w:space="1" w:color="auto"/>
-        </w:pBdr>
-        <w:spacing w:before="40" w:after="20" w:line="240" w:lineRule="auto"/>
-        <w:rPr>
-          <w:rFonts w:cs="Times New Roman"/>
-        </w:rPr>
-      </w:pPr>
+        <w:t xml:space="preserve">Lin, A., &amp; Tong, A. (2008). Re-imagining a cosmopolitan “Asian us”: Korean media flows and imaginaries of Asian modern femininities. In B. H. Chua &amp; K. Iwabuchi (Eds.), </w:t>
+      </w:r>
       <w:r>
         <w:rPr>
           <w:rFonts w:cs="Times New Roman"/>
           <w:i/>
           <w:highlight w:val="yellow"/>
         </w:rPr>
-        <w:t xml:space="preserve">Required</w:t>
+        <w:t xml:space="preserve">East Asian pop culture: Analysing the Korean Wave</w:t>
+      </w:r>
+      <w:r>
+        <w:rPr>
+          <w:rFonts w:cs="Times New Roman"/>
+          <w:highlight w:val="yellow"/>
+        </w:rPr>
+        <w:t xml:space="preserve"> (pp. 91–125). Hong Kong University Press.</w:t>
       </w:r>
     </w:p>
     <w:p>
@@ -4626,7 +4626,7 @@
           <w:rFonts w:cs="Times New Roman"/>
           <w:highlight w:val="yellow"/>
         </w:rPr>
-        <w:t xml:space="preserve">Lin, A., &amp; Tong, A. (2008). Re-imagining a cosmopolitan “Asian us”: Korean media flows and imaginaries of Asian modern femininities. In B. H. Chua &amp; K. Iwabuchi (Eds.), </w:t>
+        <w:t xml:space="preserve">Kim, Y. (2005). </w:t>
       </w:r>
       <w:r>
         <w:rPr>
@@ -4634,14 +4634,34 @@
           <w:i/>
           <w:highlight w:val="yellow"/>
         </w:rPr>
-        <w:t xml:space="preserve">East Asian pop culture: Analysing the Korean Wave</w:t>
-      </w:r>
-      <w:r>
-        <w:rPr>
-          <w:rFonts w:cs="Times New Roman"/>
-          <w:highlight w:val="yellow"/>
-        </w:rPr>
-        <w:t xml:space="preserve"> (pp. 91–125). Hong Kong University Press.</w:t>
+        <w:t xml:space="preserve">Women, television and everyday life in Korea: Journeys of hope</w:t>
+      </w:r>
+      <w:r>
+        <w:rPr>
+          <w:rFonts w:cs="Times New Roman"/>
+          <w:highlight w:val="yellow"/>
+        </w:rPr>
+        <w:t xml:space="preserve">. Routledge. A second chapter.</w:t>
+      </w:r>
+    </w:p>
+    <w:p>
+      <w:pPr>
+        <w:keepNext/>
+        <w:pBdr>
+          <w:bottom w:val="single" w:sz="4" w:space="1" w:color="auto"/>
+        </w:pBdr>
+        <w:spacing w:before="40" w:after="20" w:line="240" w:lineRule="auto"/>
+        <w:rPr>
+          <w:rFonts w:cs="Times New Roman"/>
+        </w:rPr>
+      </w:pPr>
+      <w:r>
+        <w:rPr>
+          <w:rFonts w:cs="Times New Roman"/>
+          <w:i/>
+          <w:highlight w:val="yellow"/>
+        </w:rPr>
+        <w:t xml:space="preserve">Media</w:t>
       </w:r>
     </w:p>
     <w:p>
@@ -4658,44 +4678,17 @@
       <w:r>
         <w:rPr>
           <w:rFonts w:cs="Times New Roman"/>
-          <w:highlight w:val="yellow"/>
-        </w:rPr>
-        <w:t xml:space="preserve">Kim, Y. (2005). </w:t>
-      </w:r>
-      <w:r>
-        <w:rPr>
-          <w:rFonts w:cs="Times New Roman"/>
           <w:i/>
           <w:highlight w:val="yellow"/>
         </w:rPr>
-        <w:t xml:space="preserve">Women, television and everyday life in Korea: Journeys of hope</w:t>
-      </w:r>
-      <w:r>
-        <w:rPr>
-          <w:rFonts w:cs="Times New Roman"/>
-          <w:highlight w:val="yellow"/>
-        </w:rPr>
-        <w:t xml:space="preserve">. Routledge. A second chapter.</w:t>
-      </w:r>
-    </w:p>
-    <w:p>
-      <w:pPr>
-        <w:keepNext/>
-        <w:pBdr>
-          <w:bottom w:val="single" w:sz="4" w:space="1" w:color="auto"/>
-        </w:pBdr>
-        <w:spacing w:before="40" w:after="20" w:line="240" w:lineRule="auto"/>
-        <w:rPr>
-          <w:rFonts w:cs="Times New Roman"/>
-        </w:rPr>
-      </w:pPr>
-      <w:r>
-        <w:rPr>
-          <w:rFonts w:cs="Times New Roman"/>
-          <w:i/>
-          <w:highlight w:val="yellow"/>
-        </w:rPr>
-        <w:t xml:space="preserve">Media</w:t>
+        <w:t xml:space="preserve">Dae Jang Geum</w:t>
+      </w:r>
+      <w:r>
+        <w:rPr>
+          <w:rFonts w:cs="Times New Roman"/>
+          <w:highlight w:val="yellow"/>
+        </w:rPr>
+        <w:t xml:space="preserve"> [대장금; TV series]. (2003–2004). MBC. Clips.</w:t>
       </w:r>
     </w:p>
     <w:p>
@@ -4715,14 +4708,54 @@
           <w:i/>
           <w:highlight w:val="yellow"/>
         </w:rPr>
-        <w:t xml:space="preserve">Dae Jang Geum</w:t>
-      </w:r>
-      <w:r>
-        <w:rPr>
-          <w:rFonts w:cs="Times New Roman"/>
-          <w:highlight w:val="yellow"/>
-        </w:rPr>
-        <w:t xml:space="preserve"> [대장금; TV series]. (2003–2004). MBC. Clips.</w:t>
+        <w:t xml:space="preserve">My lovely Sam Soon</w:t>
+      </w:r>
+      <w:r>
+        <w:rPr>
+          <w:rFonts w:cs="Times New Roman"/>
+          <w:highlight w:val="yellow"/>
+        </w:rPr>
+        <w:t xml:space="preserve"> [내 이름은 김삼순; TV series]. (2005). MBC. Clips.</w:t>
+      </w:r>
+    </w:p>
+    <w:p>
+      <w:pPr>
+        <w:keepNext/>
+        <w:pBdr>
+          <w:bottom w:val="single" w:sz="4" w:space="1" w:color="auto"/>
+        </w:pBdr>
+        <w:spacing w:before="120" w:after="30" w:line="240" w:lineRule="auto"/>
+        <w:rPr>
+          <w:rFonts w:cs="Times New Roman"/>
+        </w:rPr>
+      </w:pPr>
+      <w:r>
+        <w:rPr>
+          <w:rFonts w:cs="Times New Roman"/>
+          <w:b/>
+          <w:highlight w:val="yellow"/>
+        </w:rPr>
+        <w:t xml:space="preserve">Week 7</w:t>
+      </w:r>
+    </w:p>
+    <w:p>
+      <w:pPr>
+        <w:keepNext/>
+        <w:pBdr>
+          <w:bottom w:val="single" w:sz="4" w:space="1" w:color="auto"/>
+        </w:pBdr>
+        <w:spacing w:before="40" w:after="20" w:line="240" w:lineRule="auto"/>
+        <w:rPr>
+          <w:rFonts w:cs="Times New Roman"/>
+        </w:rPr>
+      </w:pPr>
+      <w:r>
+        <w:rPr>
+          <w:rFonts w:cs="Times New Roman"/>
+          <w:i/>
+          <w:highlight w:val="yellow"/>
+        </w:rPr>
+        <w:t xml:space="preserve">Required</w:t>
       </w:r>
     </w:p>
     <w:p>
@@ -4739,57 +4772,24 @@
       <w:r>
         <w:rPr>
           <w:rFonts w:cs="Times New Roman"/>
+          <w:highlight w:val="yellow"/>
+        </w:rPr>
+        <w:t xml:space="preserve">Cho, N. (2020). </w:t>
+      </w:r>
+      <w:r>
+        <w:rPr>
+          <w:rFonts w:cs="Times New Roman"/>
           <w:i/>
           <w:highlight w:val="yellow"/>
         </w:rPr>
-        <w:t xml:space="preserve">My lovely Sam Soon</w:t>
-      </w:r>
-      <w:r>
-        <w:rPr>
-          <w:rFonts w:cs="Times New Roman"/>
-          <w:highlight w:val="yellow"/>
-        </w:rPr>
-        <w:t xml:space="preserve"> [내 이름은 김삼순; TV series]. (2005). MBC. Clips.</w:t>
-      </w:r>
-    </w:p>
-    <w:p>
-      <w:pPr>
-        <w:keepNext/>
-        <w:pBdr>
-          <w:bottom w:val="single" w:sz="4" w:space="1" w:color="auto"/>
-        </w:pBdr>
-        <w:spacing w:before="120" w:after="30" w:line="240" w:lineRule="auto"/>
-        <w:rPr>
-          <w:rFonts w:cs="Times New Roman"/>
-        </w:rPr>
-      </w:pPr>
-      <w:r>
-        <w:rPr>
-          <w:rFonts w:cs="Times New Roman"/>
-          <w:b/>
-          <w:highlight w:val="yellow"/>
-        </w:rPr>
-        <w:t xml:space="preserve">Week 7</w:t>
-      </w:r>
-    </w:p>
-    <w:p>
-      <w:pPr>
-        <w:keepNext/>
-        <w:pBdr>
-          <w:bottom w:val="single" w:sz="4" w:space="1" w:color="auto"/>
-        </w:pBdr>
-        <w:spacing w:before="40" w:after="20" w:line="240" w:lineRule="auto"/>
-        <w:rPr>
-          <w:rFonts w:cs="Times New Roman"/>
-        </w:rPr>
-      </w:pPr>
-      <w:r>
-        <w:rPr>
-          <w:rFonts w:cs="Times New Roman"/>
-          <w:i/>
-          <w:highlight w:val="yellow"/>
-        </w:rPr>
-        <w:t xml:space="preserve">Required</w:t>
+        <w:t xml:space="preserve">Kim Jiyoung, born 1982</w:t>
+      </w:r>
+      <w:r>
+        <w:rPr>
+          <w:rFonts w:cs="Times New Roman"/>
+          <w:highlight w:val="yellow"/>
+        </w:rPr>
+        <w:t xml:space="preserve"> (J. Chang, Trans.). Liveright. (Original work published 2016)</w:t>
       </w:r>
     </w:p>
     <w:p>
@@ -4808,7 +4808,7 @@
           <w:rFonts w:cs="Times New Roman"/>
           <w:highlight w:val="yellow"/>
         </w:rPr>
-        <w:t xml:space="preserve">Cho, N. (2020). </w:t>
+        <w:t xml:space="preserve">Kim, J. (2021). The resurgence and popularization of feminism in South Korea: Key issues and challenges for contemporary feminist activism. </w:t>
       </w:r>
       <w:r>
         <w:rPr>
@@ -4816,14 +4816,14 @@
           <w:i/>
           <w:highlight w:val="yellow"/>
         </w:rPr>
-        <w:t xml:space="preserve">Kim Jiyoung, born 1982</w:t>
-      </w:r>
-      <w:r>
-        <w:rPr>
-          <w:rFonts w:cs="Times New Roman"/>
-          <w:highlight w:val="yellow"/>
-        </w:rPr>
-        <w:t xml:space="preserve"> (J. Chang, Trans.). Liveright. (Original work published 2016)</w:t>
+        <w:t xml:space="preserve">Korea Journal, 61</w:t>
+      </w:r>
+      <w:r>
+        <w:rPr>
+          <w:rFonts w:cs="Times New Roman"/>
+          <w:highlight w:val="yellow"/>
+        </w:rPr>
+        <w:t xml:space="preserve">(4), 75–101. Open access.</w:t>
       </w:r>
     </w:p>
     <w:p>
@@ -4842,7 +4842,7 @@
           <w:rFonts w:cs="Times New Roman"/>
           <w:highlight w:val="yellow"/>
         </w:rPr>
-        <w:t xml:space="preserve">Kim, J. (2021). The resurgence and popularization of feminism in South Korea: Key issues and challenges for contemporary feminist activism. </w:t>
+        <w:t xml:space="preserve">Kim, J. (2021). Sticky activism: The Gangnam Station murder case and new feminist practices against misogyny and femicide. </w:t>
       </w:r>
       <w:r>
         <w:rPr>
@@ -4850,14 +4850,34 @@
           <w:i/>
           <w:highlight w:val="yellow"/>
         </w:rPr>
-        <w:t xml:space="preserve">Korea Journal, 61</w:t>
-      </w:r>
-      <w:r>
-        <w:rPr>
-          <w:rFonts w:cs="Times New Roman"/>
-          <w:highlight w:val="yellow"/>
-        </w:rPr>
-        <w:t xml:space="preserve">(4), 75–101. Open access.</w:t>
+        <w:t xml:space="preserve">JCMS: Journal of Cinema and Media Studies, 60</w:t>
+      </w:r>
+      <w:r>
+        <w:rPr>
+          <w:rFonts w:cs="Times New Roman"/>
+          <w:highlight w:val="yellow"/>
+        </w:rPr>
+        <w:t xml:space="preserve">(4), 37–60.</w:t>
+      </w:r>
+    </w:p>
+    <w:p>
+      <w:pPr>
+        <w:keepNext/>
+        <w:pBdr>
+          <w:bottom w:val="single" w:sz="4" w:space="1" w:color="auto"/>
+        </w:pBdr>
+        <w:spacing w:before="40" w:after="20" w:line="240" w:lineRule="auto"/>
+        <w:rPr>
+          <w:rFonts w:cs="Times New Roman"/>
+        </w:rPr>
+      </w:pPr>
+      <w:r>
+        <w:rPr>
+          <w:rFonts w:cs="Times New Roman"/>
+          <w:i/>
+          <w:highlight w:val="yellow"/>
+        </w:rPr>
+        <w:t xml:space="preserve">Recommended</w:t>
       </w:r>
     </w:p>
     <w:p>
@@ -4876,7 +4896,7 @@
           <w:rFonts w:cs="Times New Roman"/>
           <w:highlight w:val="yellow"/>
         </w:rPr>
-        <w:t xml:space="preserve">Koo, J. (2025). “The story of you and me”: Strategic ambiguity in the paratextual reception of </w:t>
+        <w:t xml:space="preserve">Shin, K. (2021). Beyond #WithYou: The new generation of feminists and the #MeToo movement in South Korea. </w:t>
       </w:r>
       <w:r>
         <w:rPr>
@@ -4884,109 +4904,6 @@
           <w:i/>
           <w:highlight w:val="yellow"/>
         </w:rPr>
-        <w:t xml:space="preserve">Kim Ji-Young, Born 1982</w:t>
-      </w:r>
-      <w:r>
-        <w:rPr>
-          <w:rFonts w:cs="Times New Roman"/>
-          <w:highlight w:val="yellow"/>
-        </w:rPr>
-        <w:t xml:space="preserve">. </w:t>
-      </w:r>
-      <w:r>
-        <w:rPr>
-          <w:rFonts w:cs="Times New Roman"/>
-          <w:i/>
-          <w:highlight w:val="yellow"/>
-        </w:rPr>
-        <w:t xml:space="preserve">Feminist Media Studies, 25</w:t>
-      </w:r>
-      <w:r>
-        <w:rPr>
-          <w:rFonts w:cs="Times New Roman"/>
-          <w:highlight w:val="yellow"/>
-        </w:rPr>
-        <w:t xml:space="preserve">(7). https://doi.org/10.1080/14680777.2024.2363853</w:t>
-      </w:r>
-    </w:p>
-    <w:p>
-      <w:pPr>
-        <w:keepNext/>
-        <w:pBdr>
-          <w:bottom w:val="single" w:sz="4" w:space="1" w:color="auto"/>
-        </w:pBdr>
-        <w:spacing w:before="40" w:after="20" w:line="240" w:lineRule="auto"/>
-        <w:rPr>
-          <w:rFonts w:cs="Times New Roman"/>
-        </w:rPr>
-      </w:pPr>
-      <w:r>
-        <w:rPr>
-          <w:rFonts w:cs="Times New Roman"/>
-          <w:i/>
-          <w:highlight w:val="yellow"/>
-        </w:rPr>
-        <w:t xml:space="preserve">Recommended</w:t>
-      </w:r>
-    </w:p>
-    <w:p>
-      <w:pPr>
-        <w:pBdr>
-          <w:bottom w:val="single" w:sz="4" w:space="1" w:color="auto"/>
-        </w:pBdr>
-        <w:spacing w:after="40" w:line="240" w:lineRule="auto"/>
-        <w:ind w:left="360" w:hanging="360"/>
-        <w:rPr>
-          <w:rFonts w:cs="Times New Roman"/>
-        </w:rPr>
-      </w:pPr>
-      <w:r>
-        <w:rPr>
-          <w:rFonts w:cs="Times New Roman"/>
-          <w:highlight w:val="yellow"/>
-        </w:rPr>
-        <w:t xml:space="preserve">Kim, J. (2021). Sticky activism: The Gangnam Station murder case and new feminist practices against misogyny and femicide. </w:t>
-      </w:r>
-      <w:r>
-        <w:rPr>
-          <w:rFonts w:cs="Times New Roman"/>
-          <w:i/>
-          <w:highlight w:val="yellow"/>
-        </w:rPr>
-        <w:t xml:space="preserve">JCMS: Journal of Cinema and Media Studies, 60</w:t>
-      </w:r>
-      <w:r>
-        <w:rPr>
-          <w:rFonts w:cs="Times New Roman"/>
-          <w:highlight w:val="yellow"/>
-        </w:rPr>
-        <w:t xml:space="preserve">(4), 37–60.</w:t>
-      </w:r>
-    </w:p>
-    <w:p>
-      <w:pPr>
-        <w:pBdr>
-          <w:bottom w:val="single" w:sz="4" w:space="1" w:color="auto"/>
-        </w:pBdr>
-        <w:spacing w:after="40" w:line="240" w:lineRule="auto"/>
-        <w:ind w:left="360" w:hanging="360"/>
-        <w:rPr>
-          <w:rFonts w:cs="Times New Roman"/>
-        </w:rPr>
-      </w:pPr>
-      <w:r>
-        <w:rPr>
-          <w:rFonts w:cs="Times New Roman"/>
-          <w:highlight w:val="yellow"/>
-        </w:rPr>
-        <w:t xml:space="preserve">Shin, K. (2021). Beyond #WithYou: The new generation of feminists and the #MeToo movement in South Korea. </w:t>
-      </w:r>
-      <w:r>
-        <w:rPr>
-          <w:rFonts w:cs="Times New Roman"/>
-          <w:i/>
-          <w:highlight w:val="yellow"/>
-        </w:rPr>
         <w:t xml:space="preserve">Politics &amp; Gender</w:t>
       </w:r>
       <w:r>
@@ -4995,104 +4912,6 @@
           <w:highlight w:val="yellow"/>
         </w:rPr>
         <w:t xml:space="preserve">. Advance online publication.</w:t>
-      </w:r>
-    </w:p>
-    <w:p>
-      <w:pPr>
-        <w:pBdr>
-          <w:bottom w:val="single" w:sz="4" w:space="1" w:color="auto"/>
-        </w:pBdr>
-        <w:spacing w:after="40" w:line="240" w:lineRule="auto"/>
-        <w:ind w:left="360" w:hanging="360"/>
-        <w:rPr>
-          <w:rFonts w:cs="Times New Roman"/>
-        </w:rPr>
-      </w:pPr>
-      <w:r>
-        <w:rPr>
-          <w:rFonts w:cs="Times New Roman"/>
-          <w:highlight w:val="yellow"/>
-        </w:rPr>
-        <w:t xml:space="preserve">Yang, F. (2021). Possession by devil: Women’s alternative language; a feminist reading of </w:t>
-      </w:r>
-      <w:r>
-        <w:rPr>
-          <w:rFonts w:cs="Times New Roman"/>
-          <w:i/>
-          <w:highlight w:val="yellow"/>
-        </w:rPr>
-        <w:t xml:space="preserve">Kim Ji-young, Born 1982</w:t>
-      </w:r>
-      <w:r>
-        <w:rPr>
-          <w:rFonts w:cs="Times New Roman"/>
-          <w:highlight w:val="yellow"/>
-        </w:rPr>
-        <w:t xml:space="preserve">. </w:t>
-      </w:r>
-      <w:r>
-        <w:rPr>
-          <w:rFonts w:cs="Times New Roman"/>
-          <w:i/>
-          <w:highlight w:val="yellow"/>
-        </w:rPr>
-        <w:t xml:space="preserve">Feminist Media Studies</w:t>
-      </w:r>
-      <w:r>
-        <w:rPr>
-          <w:rFonts w:cs="Times New Roman"/>
-          <w:highlight w:val="yellow"/>
-        </w:rPr>
-        <w:t xml:space="preserve">. Advance online publication.</w:t>
-      </w:r>
-    </w:p>
-    <w:p>
-      <w:pPr>
-        <w:pBdr>
-          <w:bottom w:val="single" w:sz="4" w:space="1" w:color="auto"/>
-        </w:pBdr>
-        <w:spacing w:after="40" w:line="240" w:lineRule="auto"/>
-        <w:ind w:left="360" w:hanging="360"/>
-        <w:rPr>
-          <w:rFonts w:cs="Times New Roman"/>
-        </w:rPr>
-      </w:pPr>
-      <w:r>
-        <w:rPr>
-          <w:rFonts w:cs="Times New Roman"/>
-          <w:highlight w:val="yellow"/>
-        </w:rPr>
-        <w:t xml:space="preserve">Jung, H. (2021). </w:t>
-      </w:r>
-      <w:r>
-        <w:rPr>
-          <w:rFonts w:cs="Times New Roman"/>
-          <w:i/>
-          <w:highlight w:val="yellow"/>
-        </w:rPr>
-        <w:t xml:space="preserve">Kim Ji-young, Born 1982</w:t>
-      </w:r>
-      <w:r>
-        <w:rPr>
-          <w:rFonts w:cs="Times New Roman"/>
-          <w:highlight w:val="yellow"/>
-        </w:rPr>
-        <w:t xml:space="preserve"> revisited: Statistical evidence from time use surveys. </w:t>
-      </w:r>
-      <w:r>
-        <w:rPr>
-          <w:rFonts w:cs="Times New Roman"/>
-          <w:i/>
-          <w:highlight w:val="yellow"/>
-        </w:rPr>
-        <w:t xml:space="preserve">Journal of Asian Sociology, 50</w:t>
-      </w:r>
-      <w:r>
-        <w:rPr>
-          <w:rFonts w:cs="Times New Roman"/>
-          <w:highlight w:val="yellow"/>
-        </w:rPr>
-        <w:t xml:space="preserve">(1), 203–246.</w:t>
       </w:r>
     </w:p>
     <w:p>

</xml_diff>